<commit_message>
Risky users: show N/A when Entra ID P2 data is unavailable (never a false zero); client setup PDF gains 'what your tenant needs' section; guides updated
Co-Authored-By: Claude Sonnet 5.5 <noreply@anthropic.com>
</commit_message>
<xml_diff>
--- a/docs/Setup_Guide.docx
+++ b/docs/Setup_Guide.docx
@@ -3907,7 +3907,7 @@
                 <w:sz w:val="18"/>
                 <w:szCs w:val="18"/>
               </w:rPr>
-              <w:t xml:space="preserve">Risky users not showing</w:t>
+              <w:t>Risky users shows N/A (or risky users look too good to be true)</w:t>
             </w:r>
           </w:p>
         </w:tc>
@@ -3944,7 +3944,7 @@
                 <w:sz w:val="18"/>
                 <w:szCs w:val="18"/>
               </w:rPr>
-              <w:t xml:space="preserve">Requires IdentityRiskyUser.Read.All, and the tenant must have Microsoft Entra ID P2 or Microsoft 365 E5 licences.</w:t>
+              <w:t>Requires IdentityRiskyUser.Read.All, and the tenant must have Microsoft Entra ID P2 or Microsoft 365 E5 licences. Without P2 Microsoft refuses the lookup and the report now shows N/A and a note instead of “0 risky users”.</w:t>
             </w:r>
           </w:p>
         </w:tc>

</xml_diff>